<commit_message>
mofrl fitting for 2010complete birth data file
</commit_message>
<xml_diff>
--- a/model_fitting/2010/Binary_Logistic_Report.docx
+++ b/model_fitting/2010/Binary_Logistic_Report.docx
@@ -12,7 +12,7 @@
     </w:p>
     <w:p>
       <w:r>
-        <w:t>Generated on: 2026-04-06 04:21:00</w:t>
+        <w:t>Generated on: 2026-05-03 18:27:58</w:t>
       </w:r>
     </w:p>
     <w:p>
@@ -110,7 +110,7 @@
           </w:tcPr>
           <w:p>
             <w:r>
-              <w:t>-183926.7773</w:t>
+              <w:t>-183924.6347</w:t>
             </w:r>
           </w:p>
         </w:tc>
@@ -132,7 +132,7 @@
           </w:tcPr>
           <w:p>
             <w:r>
-              <w:t>-218635.2824</w:t>
+              <w:t>-218633.6594</w:t>
             </w:r>
           </w:p>
         </w:tc>
@@ -154,7 +154,7 @@
           </w:tcPr>
           <w:p>
             <w:r>
-              <w:t>69417.0101</w:t>
+              <w:t>69418.0494</w:t>
             </w:r>
           </w:p>
         </w:tc>
@@ -220,7 +220,7 @@
           </w:tcPr>
           <w:p>
             <w:r>
-              <w:t>367895.55</w:t>
+              <w:t>367891.27</w:t>
             </w:r>
           </w:p>
         </w:tc>
@@ -242,7 +242,7 @@
           </w:tcPr>
           <w:p>
             <w:r>
-              <w:t>368119.64</w:t>
+              <w:t>368115.35</w:t>
             </w:r>
           </w:p>
         </w:tc>
@@ -264,7 +264,7 @@
           </w:tcPr>
           <w:p>
             <w:r>
-              <w:t>318290</w:t>
+              <w:t>318288</w:t>
             </w:r>
           </w:p>
         </w:tc>
@@ -308,7 +308,7 @@
           </w:tcPr>
           <w:p>
             <w:r>
-              <w:t>318269.0</w:t>
+              <w:t>318267.0</w:t>
             </w:r>
           </w:p>
         </w:tc>
@@ -494,7 +494,7 @@
               <w:rPr>
                 <w:b/>
               </w:rPr>
-              <w:t>-54.0556</w:t>
+              <w:t>-54.0563</w:t>
             </w:r>
           </w:p>
         </w:tc>
@@ -585,7 +585,7 @@
               <w:rPr>
                 <w:b/>
               </w:rPr>
-              <w:t>-89.5347</w:t>
+              <w:t>-89.5346</w:t>
             </w:r>
           </w:p>
         </w:tc>
@@ -676,7 +676,7 @@
               <w:rPr>
                 <w:b/>
               </w:rPr>
-              <w:t>-116.9294</w:t>
+              <w:t>-116.9292</w:t>
             </w:r>
           </w:p>
         </w:tc>
@@ -741,7 +741,7 @@
               <w:rPr>
                 <w:b/>
               </w:rPr>
-              <w:t>-4.2015</w:t>
+              <w:t>-4.2016</w:t>
             </w:r>
           </w:p>
         </w:tc>
@@ -767,7 +767,7 @@
               <w:rPr>
                 <w:b/>
               </w:rPr>
-              <w:t>-128.7127</w:t>
+              <w:t>-128.7154</w:t>
             </w:r>
           </w:p>
         </w:tc>
@@ -858,7 +858,7 @@
               <w:rPr>
                 <w:b/>
               </w:rPr>
-              <w:t>5.8287</w:t>
+              <w:t>5.8295</w:t>
             </w:r>
           </w:p>
         </w:tc>
@@ -937,7 +937,7 @@
           </w:tcPr>
           <w:p>
             <w:r>
-              <w:t>1.2912</w:t>
+              <w:t>1.2911</w:t>
             </w:r>
           </w:p>
         </w:tc>
@@ -1373,7 +1373,7 @@
           </w:tcPr>
           <w:p>
             <w:r>
-              <w:t>0.8199</w:t>
+              <w:t>0.8198</w:t>
             </w:r>
           </w:p>
         </w:tc>
@@ -1519,7 +1519,7 @@
           </w:tcPr>
           <w:p>
             <w:r>
-              <w:t>0.1792</w:t>
+              <w:t>0.1791</w:t>
             </w:r>
           </w:p>
         </w:tc>
@@ -1539,7 +1539,7 @@
           </w:tcPr>
           <w:p>
             <w:r>
-              <w:t>0.1583</w:t>
+              <w:t>0.1582</w:t>
             </w:r>
           </w:p>
         </w:tc>
@@ -1685,7 +1685,7 @@
           </w:tcPr>
           <w:p>
             <w:r>
-              <w:t>0.7459</w:t>
+              <w:t>0.7458</w:t>
             </w:r>
           </w:p>
         </w:tc>
@@ -1695,7 +1695,7 @@
           </w:tcPr>
           <w:p>
             <w:r>
-              <w:t>0.4557</w:t>
+              <w:t>0.4558</w:t>
             </w:r>
           </w:p>
         </w:tc>
@@ -1770,7 +1770,7 @@
               <w:rPr>
                 <w:b/>
               </w:rPr>
-              <w:t>2.8978</w:t>
+              <w:t>2.8962</w:t>
             </w:r>
           </w:p>
         </w:tc>
@@ -1861,7 +1861,7 @@
               <w:rPr>
                 <w:b/>
               </w:rPr>
-              <w:t>-2.2071</w:t>
+              <w:t>-2.2063</w:t>
             </w:r>
           </w:p>
         </w:tc>
@@ -1874,7 +1874,7 @@
               <w:rPr>
                 <w:b/>
               </w:rPr>
-              <w:t>0.0273</w:t>
+              <w:t>0.0274</w:t>
             </w:r>
           </w:p>
         </w:tc>
@@ -2025,7 +2025,7 @@
               <w:rPr>
                 <w:b/>
               </w:rPr>
-              <w:t>-27.3610</w:t>
+              <w:t>-27.3643</w:t>
             </w:r>
           </w:p>
         </w:tc>
@@ -2110,10 +2110,10 @@
         <w:t xml:space="preserve">Constant (Intercept): </w:t>
       </w:r>
       <w:r>
-        <w:t xml:space="preserve">Coef = 2.6182, </w:t>
+        <w:t xml:space="preserve">Coef = 2.6183, </w:t>
       </w:r>
       <w:r>
-        <w:t xml:space="preserve">Odds Ratio = 13.7113, </w:t>
+        <w:t xml:space="preserve">Odds Ratio = 13.7128, </w:t>
       </w:r>
       <w:r>
         <w:t>p = 0.0000</w:t>
@@ -2505,7 +2505,7 @@
           </w:tcPr>
           <w:p>
             <w:r>
-              <w:t>0.0273 *</w:t>
+              <w:t>0.0274 *</w:t>
             </w:r>
           </w:p>
         </w:tc>
@@ -2850,7 +2850,7 @@
           </w:tcPr>
           <w:p>
             <w:r>
-              <w:t>62927</w:t>
+              <w:t>62926</w:t>
             </w:r>
           </w:p>
         </w:tc>
@@ -2860,7 +2860,7 @@
           </w:tcPr>
           <w:p>
             <w:r>
-              <w:t>78456</w:t>
+              <w:t>78455</w:t>
             </w:r>
           </w:p>
         </w:tc>
@@ -2886,7 +2886,7 @@
           <w:b/>
           <w:sz w:val="20"/>
         </w:rPr>
-        <w:t>logit(p) = ln(p/(1-p)) = 2.6182 - 1.7048×age_group_20-24 - 2.7750×age_group_25-29 - 3.6676×age_group_30-34 - 4.2015×age_group_35+ + 0.2142×marital_status_Unmarried + 0.7714×race_mother_Burgher + 0.2896×race_mother_Indian Moor + 0.3779×race_mother_Indian Tamil + 0.2342×race_mother_Malay + 1.2850×race_mother_Other Foreigners + 0.7245×race_mother_Other Srilankans + 0.8199×race_mother_Pakistan Moor + 0.7941×race_mother_Sinhalese + 0.1792×race_mother_Srilankan Chetty + 0.2509×race_mother_Srilankan Moor + 0.4375×race_mother_Srilankan Tamil + 0.0232×child_sex_Male - 0.0773×Hospital or Not_Not In Hospital - 0.1462×multiple_birth_Triplets - 0.0002×Birth_Weight(grams)</w:t>
+        <w:t>logit(p) = ln(p/(1-p)) = 2.6183 - 1.7048×age_group_20-24 - 2.7750×age_group_25-29 - 3.6676×age_group_30-34 - 4.2016×age_group_35+ + 0.2142×marital_status_Unmarried + 0.7714×race_mother_Burgher + 0.2896×race_mother_Indian Moor + 0.3779×race_mother_Indian Tamil + 0.2342×race_mother_Malay + 1.2850×race_mother_Other Foreigners + 0.7245×race_mother_Other Srilankans + 0.8198×race_mother_Pakistan Moor + 0.7941×race_mother_Sinhalese + 0.1791×race_mother_Srilankan Chetty + 0.2509×race_mother_Srilankan Moor + 0.4375×race_mother_Srilankan Tamil + 0.0232×child_sex_Male - 0.0773×Hospital or Not_Not In Hospital - 0.1462×multiple_birth_Triplets - 0.0002×Birth_Weight(grams)</w:t>
       </w:r>
     </w:p>
     <w:p>
@@ -3874,7 +3874,7 @@
           </w:tcPr>
           <w:p>
             <w:r>
-              <w:t>7.744</w:t>
+              <w:t>7.743</w:t>
             </w:r>
           </w:p>
         </w:tc>
@@ -4002,7 +4002,7 @@
           </w:tcPr>
           <w:p>
             <w:r>
-              <w:t>11.003</w:t>
+              <w:t>11.002</w:t>
             </w:r>
           </w:p>
         </w:tc>
@@ -4130,7 +4130,7 @@
           </w:tcPr>
           <w:p>
             <w:r>
-              <w:t>4.891</w:t>
+              <w:t>4.890</w:t>
             </w:r>
           </w:p>
         </w:tc>
@@ -4140,7 +4140,7 @@
           </w:tcPr>
           <w:p>
             <w:r>
-              <w:t>0.4557</w:t>
+              <w:t>0.4558</w:t>
             </w:r>
           </w:p>
         </w:tc>
@@ -4294,7 +4294,7 @@
               <w:rPr>
                 <w:b/>
               </w:rPr>
-              <w:t>0.0273</w:t>
+              <w:t>0.0274</w:t>
             </w:r>
           </w:p>
         </w:tc>
@@ -4723,949 +4723,6 @@
           </w:tcPr>
           <w:p>
             <w:r>
-              <w:t>3.615</w:t>
-            </w:r>
-          </w:p>
-        </w:tc>
-        <w:tc>
-          <w:tcPr>
-            <w:tcW w:type="dxa" w:w="2160"/>
-          </w:tcPr>
-          <w:p>
-            <w:r>
-              <w:t>(1.075-12.153)</w:t>
-            </w:r>
-          </w:p>
-        </w:tc>
-        <w:tc>
-          <w:tcPr>
-            <w:tcW w:type="dxa" w:w="2160"/>
-          </w:tcPr>
-          <w:p/>
-        </w:tc>
-      </w:tr>
-      <w:tr>
-        <w:tc>
-          <w:tcPr>
-            <w:tcW w:type="dxa" w:w="2160"/>
-          </w:tcPr>
-          <w:p/>
-        </w:tc>
-        <w:tc>
-          <w:tcPr>
-            <w:tcW w:type="dxa" w:w="2160"/>
-          </w:tcPr>
-          <w:p/>
-        </w:tc>
-        <w:tc>
-          <w:tcPr>
-            <w:tcW w:type="dxa" w:w="2160"/>
-          </w:tcPr>
-          <w:p/>
-        </w:tc>
-        <w:tc>
-          <w:tcPr>
-            <w:tcW w:type="dxa" w:w="2160"/>
-          </w:tcPr>
-          <w:p/>
-        </w:tc>
-      </w:tr>
-      <w:tr>
-        <w:tc>
-          <w:tcPr>
-            <w:tcW w:type="dxa" w:w="2160"/>
-          </w:tcPr>
-          <w:p/>
-        </w:tc>
-        <w:tc>
-          <w:tcPr>
-            <w:tcW w:type="dxa" w:w="2160"/>
-          </w:tcPr>
-          <w:p/>
-        </w:tc>
-        <w:tc>
-          <w:tcPr>
-            <w:tcW w:type="dxa" w:w="2160"/>
-          </w:tcPr>
-          <w:p/>
-        </w:tc>
-        <w:tc>
-          <w:tcPr>
-            <w:tcW w:type="dxa" w:w="2160"/>
-          </w:tcPr>
-          <w:p/>
-        </w:tc>
-      </w:tr>
-      <w:tr>
-        <w:tc>
-          <w:tcPr>
-            <w:tcW w:type="dxa" w:w="2160"/>
-          </w:tcPr>
-          <w:p/>
-        </w:tc>
-        <w:tc>
-          <w:tcPr>
-            <w:tcW w:type="dxa" w:w="2160"/>
-          </w:tcPr>
-          <w:p/>
-        </w:tc>
-        <w:tc>
-          <w:tcPr>
-            <w:tcW w:type="dxa" w:w="2160"/>
-          </w:tcPr>
-          <w:p/>
-        </w:tc>
-        <w:tc>
-          <w:tcPr>
-            <w:tcW w:type="dxa" w:w="2160"/>
-          </w:tcPr>
-          <w:p/>
-        </w:tc>
-      </w:tr>
-      <w:tr>
-        <w:tc>
-          <w:tcPr>
-            <w:tcW w:type="dxa" w:w="2160"/>
-          </w:tcPr>
-          <w:p/>
-        </w:tc>
-        <w:tc>
-          <w:tcPr>
-            <w:tcW w:type="dxa" w:w="2160"/>
-          </w:tcPr>
-          <w:p/>
-        </w:tc>
-        <w:tc>
-          <w:tcPr>
-            <w:tcW w:type="dxa" w:w="2160"/>
-          </w:tcPr>
-          <w:p/>
-        </w:tc>
-        <w:tc>
-          <w:tcPr>
-            <w:tcW w:type="dxa" w:w="2160"/>
-          </w:tcPr>
-          <w:p/>
-        </w:tc>
-      </w:tr>
-    </w:tbl>
-    <w:p>
-      <w:pPr>
-        <w:pStyle w:val="Heading1"/>
-      </w:pPr>
-      <w:r>
-        <w:t>7.2 Odds Ratios - Binary Logistic Regression</w:t>
-      </w:r>
-    </w:p>
-    <w:p>
-      <w:r>
-        <w:t>Odds Ratios (OR) are derived by exponentiating the coefficients from the binary logistic regression model. They represent the multiplicative effect on the odds of being first-born versus later-born.</w:t>
-      </w:r>
-    </w:p>
-    <w:p>
-      <w:pPr>
-        <w:pStyle w:val="IntenseQuote"/>
-      </w:pPr>
-      <w:r>
-        <w:t>Interpretation guidelines:</w:t>
-        <w:br/>
-        <w:t>• OR = 1.00: No effect on the odds of being first-born</w:t>
-        <w:br/>
-        <w:t>• OR &gt; 1.00: Associated with HIGHER odds of being first-born</w:t>
-        <w:br/>
-        <w:t>• OR &lt; 1.00: Associated with LOWER odds of being first-born (higher odds of being later-born)</w:t>
-        <w:br/>
-        <w:br/>
-        <w:t>For a one-unit increase in the predictor, the odds of being first-born are multiplied by the OR.</w:t>
-      </w:r>
-    </w:p>
-    <w:p>
-      <w:pPr>
-        <w:pStyle w:val="Heading2"/>
-      </w:pPr>
-      <w:r>
-        <w:t>Complete Odds Ratios Table</w:t>
-      </w:r>
-    </w:p>
-    <w:tbl>
-      <w:tblPr>
-        <w:tblStyle w:val="LightGrid-Accent1"/>
-        <w:tblW w:type="auto" w:w="0"/>
-        <w:tblLayout w:type="fixed"/>
-        <w:tblLook w:firstColumn="1" w:firstRow="1" w:lastColumn="0" w:lastRow="0" w:noHBand="0" w:noVBand="1" w:val="04A0"/>
-      </w:tblPr>
-      <w:tblGrid>
-        <w:gridCol w:w="2592"/>
-        <w:gridCol w:w="1152"/>
-        <w:gridCol w:w="1152"/>
-        <w:gridCol w:w="1152"/>
-        <w:gridCol w:w="1296"/>
-        <w:gridCol w:w="864"/>
-      </w:tblGrid>
-      <w:tr>
-        <w:tc>
-          <w:tcPr>
-            <w:tcW w:type="dxa" w:w="1440"/>
-          </w:tcPr>
-          <w:p>
-            <w:pPr>
-              <w:jc w:val="center"/>
-            </w:pPr>
-            <w:r>
-              <w:rPr>
-                <w:b/>
-              </w:rPr>
-              <w:t>Variable</w:t>
-            </w:r>
-          </w:p>
-        </w:tc>
-        <w:tc>
-          <w:tcPr>
-            <w:tcW w:type="dxa" w:w="1440"/>
-          </w:tcPr>
-          <w:p>
-            <w:pPr>
-              <w:jc w:val="center"/>
-            </w:pPr>
-            <w:r>
-              <w:rPr>
-                <w:b/>
-              </w:rPr>
-              <w:t>Odds Ratio</w:t>
-            </w:r>
-          </w:p>
-        </w:tc>
-        <w:tc>
-          <w:tcPr>
-            <w:tcW w:type="dxa" w:w="1440"/>
-          </w:tcPr>
-          <w:p>
-            <w:pPr>
-              <w:jc w:val="center"/>
-            </w:pPr>
-            <w:r>
-              <w:rPr>
-                <w:b/>
-              </w:rPr>
-              <w:t>CI Lower</w:t>
-            </w:r>
-          </w:p>
-        </w:tc>
-        <w:tc>
-          <w:tcPr>
-            <w:tcW w:type="dxa" w:w="1440"/>
-          </w:tcPr>
-          <w:p>
-            <w:pPr>
-              <w:jc w:val="center"/>
-            </w:pPr>
-            <w:r>
-              <w:rPr>
-                <w:b/>
-              </w:rPr>
-              <w:t>CI Upper</w:t>
-            </w:r>
-          </w:p>
-        </w:tc>
-        <w:tc>
-          <w:tcPr>
-            <w:tcW w:type="dxa" w:w="1440"/>
-          </w:tcPr>
-          <w:p>
-            <w:pPr>
-              <w:jc w:val="center"/>
-            </w:pPr>
-            <w:r>
-              <w:rPr>
-                <w:b/>
-              </w:rPr>
-              <w:t>p-value</w:t>
-            </w:r>
-          </w:p>
-        </w:tc>
-        <w:tc>
-          <w:tcPr>
-            <w:tcW w:type="dxa" w:w="1440"/>
-          </w:tcPr>
-          <w:p>
-            <w:pPr>
-              <w:jc w:val="center"/>
-            </w:pPr>
-            <w:r>
-              <w:rPr>
-                <w:b/>
-              </w:rPr>
-              <w:t>Sig</w:t>
-            </w:r>
-          </w:p>
-        </w:tc>
-      </w:tr>
-      <w:tr>
-        <w:tc>
-          <w:tcPr>
-            <w:tcW w:type="dxa" w:w="1440"/>
-          </w:tcPr>
-          <w:p>
-            <w:r>
-              <w:rPr>
-                <w:b/>
-              </w:rPr>
-              <w:t>age_group_20-24</w:t>
-            </w:r>
-          </w:p>
-        </w:tc>
-        <w:tc>
-          <w:tcPr>
-            <w:tcW w:type="dxa" w:w="1440"/>
-          </w:tcPr>
-          <w:p>
-            <w:r>
-              <w:rPr>
-                <w:b/>
-                <w:color w:val="0066CC"/>
-              </w:rPr>
-              <w:t>0.182</w:t>
-            </w:r>
-          </w:p>
-        </w:tc>
-        <w:tc>
-          <w:tcPr>
-            <w:tcW w:type="dxa" w:w="1440"/>
-          </w:tcPr>
-          <w:p>
-            <w:r>
-              <w:rPr>
-                <w:b/>
-              </w:rPr>
-              <w:t>0.171</w:t>
-            </w:r>
-          </w:p>
-        </w:tc>
-        <w:tc>
-          <w:tcPr>
-            <w:tcW w:type="dxa" w:w="1440"/>
-          </w:tcPr>
-          <w:p>
-            <w:r>
-              <w:rPr>
-                <w:b/>
-              </w:rPr>
-              <w:t>0.193</w:t>
-            </w:r>
-          </w:p>
-        </w:tc>
-        <w:tc>
-          <w:tcPr>
-            <w:tcW w:type="dxa" w:w="1440"/>
-          </w:tcPr>
-          <w:p>
-            <w:r>
-              <w:rPr>
-                <w:b/>
-              </w:rPr>
-              <w:t>0.0000</w:t>
-            </w:r>
-          </w:p>
-        </w:tc>
-        <w:tc>
-          <w:tcPr>
-            <w:tcW w:type="dxa" w:w="1440"/>
-          </w:tcPr>
-          <w:p>
-            <w:r>
-              <w:t>***</w:t>
-            </w:r>
-          </w:p>
-        </w:tc>
-      </w:tr>
-      <w:tr>
-        <w:tc>
-          <w:tcPr>
-            <w:tcW w:type="dxa" w:w="1440"/>
-          </w:tcPr>
-          <w:p>
-            <w:r>
-              <w:rPr>
-                <w:b/>
-              </w:rPr>
-              <w:t>age_group_25-29</w:t>
-            </w:r>
-          </w:p>
-        </w:tc>
-        <w:tc>
-          <w:tcPr>
-            <w:tcW w:type="dxa" w:w="1440"/>
-          </w:tcPr>
-          <w:p>
-            <w:r>
-              <w:rPr>
-                <w:b/>
-                <w:color w:val="0066CC"/>
-              </w:rPr>
-              <w:t>0.062</w:t>
-            </w:r>
-          </w:p>
-        </w:tc>
-        <w:tc>
-          <w:tcPr>
-            <w:tcW w:type="dxa" w:w="1440"/>
-          </w:tcPr>
-          <w:p>
-            <w:r>
-              <w:rPr>
-                <w:b/>
-              </w:rPr>
-              <w:t>0.059</w:t>
-            </w:r>
-          </w:p>
-        </w:tc>
-        <w:tc>
-          <w:tcPr>
-            <w:tcW w:type="dxa" w:w="1440"/>
-          </w:tcPr>
-          <w:p>
-            <w:r>
-              <w:rPr>
-                <w:b/>
-              </w:rPr>
-              <w:t>0.066</w:t>
-            </w:r>
-          </w:p>
-        </w:tc>
-        <w:tc>
-          <w:tcPr>
-            <w:tcW w:type="dxa" w:w="1440"/>
-          </w:tcPr>
-          <w:p>
-            <w:r>
-              <w:rPr>
-                <w:b/>
-              </w:rPr>
-              <w:t>0.0000</w:t>
-            </w:r>
-          </w:p>
-        </w:tc>
-        <w:tc>
-          <w:tcPr>
-            <w:tcW w:type="dxa" w:w="1440"/>
-          </w:tcPr>
-          <w:p>
-            <w:r>
-              <w:t>***</w:t>
-            </w:r>
-          </w:p>
-        </w:tc>
-      </w:tr>
-      <w:tr>
-        <w:tc>
-          <w:tcPr>
-            <w:tcW w:type="dxa" w:w="1440"/>
-          </w:tcPr>
-          <w:p>
-            <w:r>
-              <w:rPr>
-                <w:b/>
-              </w:rPr>
-              <w:t>age_group_30-34</w:t>
-            </w:r>
-          </w:p>
-        </w:tc>
-        <w:tc>
-          <w:tcPr>
-            <w:tcW w:type="dxa" w:w="1440"/>
-          </w:tcPr>
-          <w:p>
-            <w:r>
-              <w:rPr>
-                <w:b/>
-                <w:color w:val="0066CC"/>
-              </w:rPr>
-              <w:t>0.026</w:t>
-            </w:r>
-          </w:p>
-        </w:tc>
-        <w:tc>
-          <w:tcPr>
-            <w:tcW w:type="dxa" w:w="1440"/>
-          </w:tcPr>
-          <w:p>
-            <w:r>
-              <w:rPr>
-                <w:b/>
-              </w:rPr>
-              <w:t>0.024</w:t>
-            </w:r>
-          </w:p>
-        </w:tc>
-        <w:tc>
-          <w:tcPr>
-            <w:tcW w:type="dxa" w:w="1440"/>
-          </w:tcPr>
-          <w:p>
-            <w:r>
-              <w:rPr>
-                <w:b/>
-              </w:rPr>
-              <w:t>0.027</w:t>
-            </w:r>
-          </w:p>
-        </w:tc>
-        <w:tc>
-          <w:tcPr>
-            <w:tcW w:type="dxa" w:w="1440"/>
-          </w:tcPr>
-          <w:p>
-            <w:r>
-              <w:rPr>
-                <w:b/>
-              </w:rPr>
-              <w:t>0.0000</w:t>
-            </w:r>
-          </w:p>
-        </w:tc>
-        <w:tc>
-          <w:tcPr>
-            <w:tcW w:type="dxa" w:w="1440"/>
-          </w:tcPr>
-          <w:p>
-            <w:r>
-              <w:t>***</w:t>
-            </w:r>
-          </w:p>
-        </w:tc>
-      </w:tr>
-      <w:tr>
-        <w:tc>
-          <w:tcPr>
-            <w:tcW w:type="dxa" w:w="1440"/>
-          </w:tcPr>
-          <w:p>
-            <w:r>
-              <w:rPr>
-                <w:b/>
-              </w:rPr>
-              <w:t>age_group_35+</w:t>
-            </w:r>
-          </w:p>
-        </w:tc>
-        <w:tc>
-          <w:tcPr>
-            <w:tcW w:type="dxa" w:w="1440"/>
-          </w:tcPr>
-          <w:p>
-            <w:r>
-              <w:rPr>
-                <w:b/>
-                <w:color w:val="0066CC"/>
-              </w:rPr>
-              <w:t>0.015</w:t>
-            </w:r>
-          </w:p>
-        </w:tc>
-        <w:tc>
-          <w:tcPr>
-            <w:tcW w:type="dxa" w:w="1440"/>
-          </w:tcPr>
-          <w:p>
-            <w:r>
-              <w:rPr>
-                <w:b/>
-              </w:rPr>
-              <w:t>0.014</w:t>
-            </w:r>
-          </w:p>
-        </w:tc>
-        <w:tc>
-          <w:tcPr>
-            <w:tcW w:type="dxa" w:w="1440"/>
-          </w:tcPr>
-          <w:p>
-            <w:r>
-              <w:rPr>
-                <w:b/>
-              </w:rPr>
-              <w:t>0.016</w:t>
-            </w:r>
-          </w:p>
-        </w:tc>
-        <w:tc>
-          <w:tcPr>
-            <w:tcW w:type="dxa" w:w="1440"/>
-          </w:tcPr>
-          <w:p>
-            <w:r>
-              <w:rPr>
-                <w:b/>
-              </w:rPr>
-              <w:t>0.0000</w:t>
-            </w:r>
-          </w:p>
-        </w:tc>
-        <w:tc>
-          <w:tcPr>
-            <w:tcW w:type="dxa" w:w="1440"/>
-          </w:tcPr>
-          <w:p>
-            <w:r>
-              <w:t>***</w:t>
-            </w:r>
-          </w:p>
-        </w:tc>
-      </w:tr>
-      <w:tr>
-        <w:tc>
-          <w:tcPr>
-            <w:tcW w:type="dxa" w:w="1440"/>
-          </w:tcPr>
-          <w:p>
-            <w:r>
-              <w:rPr>
-                <w:b/>
-              </w:rPr>
-              <w:t>marital_status_Unmarried</w:t>
-            </w:r>
-          </w:p>
-        </w:tc>
-        <w:tc>
-          <w:tcPr>
-            <w:tcW w:type="dxa" w:w="1440"/>
-          </w:tcPr>
-          <w:p>
-            <w:r>
-              <w:rPr>
-                <w:b/>
-                <w:color w:val="CC6600"/>
-              </w:rPr>
-              <w:t>1.239</w:t>
-            </w:r>
-          </w:p>
-        </w:tc>
-        <w:tc>
-          <w:tcPr>
-            <w:tcW w:type="dxa" w:w="1440"/>
-          </w:tcPr>
-          <w:p>
-            <w:r>
-              <w:rPr>
-                <w:b/>
-              </w:rPr>
-              <w:t>1.153</w:t>
-            </w:r>
-          </w:p>
-        </w:tc>
-        <w:tc>
-          <w:tcPr>
-            <w:tcW w:type="dxa" w:w="1440"/>
-          </w:tcPr>
-          <w:p>
-            <w:r>
-              <w:rPr>
-                <w:b/>
-              </w:rPr>
-              <w:t>1.331</w:t>
-            </w:r>
-          </w:p>
-        </w:tc>
-        <w:tc>
-          <w:tcPr>
-            <w:tcW w:type="dxa" w:w="1440"/>
-          </w:tcPr>
-          <w:p>
-            <w:r>
-              <w:rPr>
-                <w:b/>
-              </w:rPr>
-              <w:t>0.0000</w:t>
-            </w:r>
-          </w:p>
-        </w:tc>
-        <w:tc>
-          <w:tcPr>
-            <w:tcW w:type="dxa" w:w="1440"/>
-          </w:tcPr>
-          <w:p>
-            <w:r>
-              <w:t>***</w:t>
-            </w:r>
-          </w:p>
-        </w:tc>
-      </w:tr>
-      <w:tr>
-        <w:tc>
-          <w:tcPr>
-            <w:tcW w:type="dxa" w:w="1440"/>
-          </w:tcPr>
-          <w:p>
-            <w:r>
-              <w:t>race_mother_Burgher</w:t>
-            </w:r>
-          </w:p>
-        </w:tc>
-        <w:tc>
-          <w:tcPr>
-            <w:tcW w:type="dxa" w:w="1440"/>
-          </w:tcPr>
-          <w:p>
-            <w:r>
-              <w:rPr>
-                <w:b/>
-                <w:color w:val="CC6600"/>
-              </w:rPr>
-              <w:t>2.163</w:t>
-            </w:r>
-          </w:p>
-        </w:tc>
-        <w:tc>
-          <w:tcPr>
-            <w:tcW w:type="dxa" w:w="1440"/>
-          </w:tcPr>
-          <w:p>
-            <w:r>
-              <w:t>0.671</w:t>
-            </w:r>
-          </w:p>
-        </w:tc>
-        <w:tc>
-          <w:tcPr>
-            <w:tcW w:type="dxa" w:w="1440"/>
-          </w:tcPr>
-          <w:p>
-            <w:r>
-              <w:t>6.975</w:t>
-            </w:r>
-          </w:p>
-        </w:tc>
-        <w:tc>
-          <w:tcPr>
-            <w:tcW w:type="dxa" w:w="1440"/>
-          </w:tcPr>
-          <w:p>
-            <w:r>
-              <w:t>0.1967</w:t>
-            </w:r>
-          </w:p>
-        </w:tc>
-        <w:tc>
-          <w:tcPr>
-            <w:tcW w:type="dxa" w:w="1440"/>
-          </w:tcPr>
-          <w:p>
-            <w:r/>
-          </w:p>
-        </w:tc>
-      </w:tr>
-      <w:tr>
-        <w:tc>
-          <w:tcPr>
-            <w:tcW w:type="dxa" w:w="1440"/>
-          </w:tcPr>
-          <w:p>
-            <w:r>
-              <w:t>race_mother_Indian Moor</w:t>
-            </w:r>
-          </w:p>
-        </w:tc>
-        <w:tc>
-          <w:tcPr>
-            <w:tcW w:type="dxa" w:w="1440"/>
-          </w:tcPr>
-          <w:p>
-            <w:r>
-              <w:rPr>
-                <w:b/>
-                <w:color w:val="CC6600"/>
-              </w:rPr>
-              <w:t>1.336</w:t>
-            </w:r>
-          </w:p>
-        </w:tc>
-        <w:tc>
-          <w:tcPr>
-            <w:tcW w:type="dxa" w:w="1440"/>
-          </w:tcPr>
-          <w:p>
-            <w:r>
-              <w:t>0.340</w:t>
-            </w:r>
-          </w:p>
-        </w:tc>
-        <w:tc>
-          <w:tcPr>
-            <w:tcW w:type="dxa" w:w="1440"/>
-          </w:tcPr>
-          <w:p>
-            <w:r>
-              <w:t>5.253</w:t>
-            </w:r>
-          </w:p>
-        </w:tc>
-        <w:tc>
-          <w:tcPr>
-            <w:tcW w:type="dxa" w:w="1440"/>
-          </w:tcPr>
-          <w:p>
-            <w:r>
-              <w:t>0.6785</w:t>
-            </w:r>
-          </w:p>
-        </w:tc>
-        <w:tc>
-          <w:tcPr>
-            <w:tcW w:type="dxa" w:w="1440"/>
-          </w:tcPr>
-          <w:p>
-            <w:r/>
-          </w:p>
-        </w:tc>
-      </w:tr>
-      <w:tr>
-        <w:tc>
-          <w:tcPr>
-            <w:tcW w:type="dxa" w:w="1440"/>
-          </w:tcPr>
-          <w:p>
-            <w:r>
-              <w:t>race_mother_Indian Tamil</w:t>
-            </w:r>
-          </w:p>
-        </w:tc>
-        <w:tc>
-          <w:tcPr>
-            <w:tcW w:type="dxa" w:w="1440"/>
-          </w:tcPr>
-          <w:p>
-            <w:r>
-              <w:rPr>
-                <w:b/>
-                <w:color w:val="CC6600"/>
-              </w:rPr>
-              <w:t>1.459</w:t>
-            </w:r>
-          </w:p>
-        </w:tc>
-        <w:tc>
-          <w:tcPr>
-            <w:tcW w:type="dxa" w:w="1440"/>
-          </w:tcPr>
-          <w:p>
-            <w:r>
-              <w:t>0.462</w:t>
-            </w:r>
-          </w:p>
-        </w:tc>
-        <w:tc>
-          <w:tcPr>
-            <w:tcW w:type="dxa" w:w="1440"/>
-          </w:tcPr>
-          <w:p>
-            <w:r>
-              <w:t>4.609</w:t>
-            </w:r>
-          </w:p>
-        </w:tc>
-        <w:tc>
-          <w:tcPr>
-            <w:tcW w:type="dxa" w:w="1440"/>
-          </w:tcPr>
-          <w:p>
-            <w:r>
-              <w:t>0.5196</w:t>
-            </w:r>
-          </w:p>
-        </w:tc>
-        <w:tc>
-          <w:tcPr>
-            <w:tcW w:type="dxa" w:w="1440"/>
-          </w:tcPr>
-          <w:p>
-            <w:r/>
-          </w:p>
-        </w:tc>
-      </w:tr>
-      <w:tr>
-        <w:tc>
-          <w:tcPr>
-            <w:tcW w:type="dxa" w:w="1440"/>
-          </w:tcPr>
-          <w:p>
-            <w:r>
-              <w:t>race_mother_Malay</w:t>
-            </w:r>
-          </w:p>
-        </w:tc>
-        <w:tc>
-          <w:tcPr>
-            <w:tcW w:type="dxa" w:w="1440"/>
-          </w:tcPr>
-          <w:p>
-            <w:r>
-              <w:rPr>
-                <w:b/>
-                <w:color w:val="CC6600"/>
-              </w:rPr>
-              <w:t>1.264</w:t>
-            </w:r>
-          </w:p>
-        </w:tc>
-        <w:tc>
-          <w:tcPr>
-            <w:tcW w:type="dxa" w:w="1440"/>
-          </w:tcPr>
-          <w:p>
-            <w:r>
-              <w:t>0.393</w:t>
-            </w:r>
-          </w:p>
-        </w:tc>
-        <w:tc>
-          <w:tcPr>
-            <w:tcW w:type="dxa" w:w="1440"/>
-          </w:tcPr>
-          <w:p>
-            <w:r>
-              <w:t>4.067</w:t>
-            </w:r>
-          </w:p>
-        </w:tc>
-        <w:tc>
-          <w:tcPr>
-            <w:tcW w:type="dxa" w:w="1440"/>
-          </w:tcPr>
-          <w:p>
-            <w:r>
-              <w:t>0.6944</w:t>
-            </w:r>
-          </w:p>
-        </w:tc>
-        <w:tc>
-          <w:tcPr>
-            <w:tcW w:type="dxa" w:w="1440"/>
-          </w:tcPr>
-          <w:p>
-            <w:r/>
-          </w:p>
-        </w:tc>
-      </w:tr>
-      <w:tr>
-        <w:tc>
-          <w:tcPr>
-            <w:tcW w:type="dxa" w:w="1440"/>
-          </w:tcPr>
-          <w:p>
-            <w:r>
-              <w:rPr>
-                <w:b/>
-              </w:rPr>
-              <w:t>race_mother_Other Foreigners</w:t>
-            </w:r>
-          </w:p>
-        </w:tc>
-        <w:tc>
-          <w:tcPr>
-            <w:tcW w:type="dxa" w:w="1440"/>
-          </w:tcPr>
-          <w:p>
-            <w:r>
               <w:rPr>
                 <w:b/>
                 <w:color w:val="CC6600"/>
@@ -5676,50 +4733,21 @@
         </w:tc>
         <w:tc>
           <w:tcPr>
-            <w:tcW w:type="dxa" w:w="1440"/>
-          </w:tcPr>
-          <w:p>
-            <w:r>
-              <w:rPr>
-                <w:b/>
-              </w:rPr>
-              <w:t>1.075</w:t>
-            </w:r>
-          </w:p>
-        </w:tc>
-        <w:tc>
-          <w:tcPr>
-            <w:tcW w:type="dxa" w:w="1440"/>
-          </w:tcPr>
-          <w:p>
-            <w:r>
-              <w:rPr>
-                <w:b/>
-              </w:rPr>
-              <w:t>12.153</w:t>
-            </w:r>
-          </w:p>
-        </w:tc>
-        <w:tc>
-          <w:tcPr>
-            <w:tcW w:type="dxa" w:w="1440"/>
-          </w:tcPr>
-          <w:p>
-            <w:r>
-              <w:rPr>
-                <w:b/>
-              </w:rPr>
-              <w:t>0.0378</w:t>
-            </w:r>
-          </w:p>
-        </w:tc>
-        <w:tc>
-          <w:tcPr>
-            <w:tcW w:type="dxa" w:w="1440"/>
-          </w:tcPr>
-          <w:p>
-            <w:r>
-              <w:t>*</w:t>
+            <w:tcW w:type="dxa" w:w="2160"/>
+          </w:tcPr>
+          <w:p>
+            <w:r>
+              <w:t>(1.075-12.153)</w:t>
+            </w:r>
+          </w:p>
+        </w:tc>
+        <w:tc>
+          <w:tcPr>
+            <w:tcW w:type="dxa" w:w="2160"/>
+          </w:tcPr>
+          <w:p>
+            <w:r>
+              <w:t>261.5% increase</w:t>
             </w:r>
           </w:p>
         </w:tc>
@@ -5727,71 +4755,7 @@
       <w:tr>
         <w:tc>
           <w:tcPr>
-            <w:tcW w:type="dxa" w:w="1440"/>
-          </w:tcPr>
-          <w:p>
-            <w:r>
-              <w:t>race_mother_Other Srilankans</w:t>
-            </w:r>
-          </w:p>
-        </w:tc>
-        <w:tc>
-          <w:tcPr>
-            <w:tcW w:type="dxa" w:w="1440"/>
-          </w:tcPr>
-          <w:p>
-            <w:r>
-              <w:rPr>
-                <w:b/>
-                <w:color w:val="CC6600"/>
-              </w:rPr>
-              <w:t>2.064</w:t>
-            </w:r>
-          </w:p>
-        </w:tc>
-        <w:tc>
-          <w:tcPr>
-            <w:tcW w:type="dxa" w:w="1440"/>
-          </w:tcPr>
-          <w:p>
-            <w:r>
-              <w:t>0.548</w:t>
-            </w:r>
-          </w:p>
-        </w:tc>
-        <w:tc>
-          <w:tcPr>
-            <w:tcW w:type="dxa" w:w="1440"/>
-          </w:tcPr>
-          <w:p>
-            <w:r>
-              <w:t>7.774</w:t>
-            </w:r>
-          </w:p>
-        </w:tc>
-        <w:tc>
-          <w:tcPr>
-            <w:tcW w:type="dxa" w:w="1440"/>
-          </w:tcPr>
-          <w:p>
-            <w:r>
-              <w:t>0.2843</w:t>
-            </w:r>
-          </w:p>
-        </w:tc>
-        <w:tc>
-          <w:tcPr>
-            <w:tcW w:type="dxa" w:w="1440"/>
-          </w:tcPr>
-          <w:p>
-            <w:r/>
-          </w:p>
-        </w:tc>
-      </w:tr>
-      <w:tr>
-        <w:tc>
-          <w:tcPr>
-            <w:tcW w:type="dxa" w:w="1440"/>
+            <w:tcW w:type="dxa" w:w="2160"/>
           </w:tcPr>
           <w:p>
             <w:r>
@@ -5801,7 +4765,7 @@
         </w:tc>
         <w:tc>
           <w:tcPr>
-            <w:tcW w:type="dxa" w:w="1440"/>
+            <w:tcW w:type="dxa" w:w="2160"/>
           </w:tcPr>
           <w:p>
             <w:r>
@@ -5815,930 +4779,11 @@
         </w:tc>
         <w:tc>
           <w:tcPr>
-            <w:tcW w:type="dxa" w:w="1440"/>
-          </w:tcPr>
-          <w:p>
-            <w:r>
-              <w:t>0.666</w:t>
-            </w:r>
-          </w:p>
-        </w:tc>
-        <w:tc>
-          <w:tcPr>
-            <w:tcW w:type="dxa" w:w="1440"/>
-          </w:tcPr>
-          <w:p>
-            <w:r>
-              <w:t>7.744</w:t>
-            </w:r>
-          </w:p>
-        </w:tc>
-        <w:tc>
-          <w:tcPr>
-            <w:tcW w:type="dxa" w:w="1440"/>
-          </w:tcPr>
-          <w:p>
-            <w:r>
-              <w:t>0.1903</w:t>
-            </w:r>
-          </w:p>
-        </w:tc>
-        <w:tc>
-          <w:tcPr>
-            <w:tcW w:type="dxa" w:w="1440"/>
-          </w:tcPr>
-          <w:p>
-            <w:r/>
-          </w:p>
-        </w:tc>
-      </w:tr>
-      <w:tr>
-        <w:tc>
-          <w:tcPr>
-            <w:tcW w:type="dxa" w:w="1440"/>
-          </w:tcPr>
-          <w:p>
-            <w:r>
-              <w:t>race_mother_Sinhalese</w:t>
-            </w:r>
-          </w:p>
-        </w:tc>
-        <w:tc>
-          <w:tcPr>
-            <w:tcW w:type="dxa" w:w="1440"/>
-          </w:tcPr>
-          <w:p>
-            <w:r>
-              <w:rPr>
-                <w:b/>
-                <w:color w:val="CC6600"/>
-              </w:rPr>
-              <w:t>2.212</w:t>
-            </w:r>
-          </w:p>
-        </w:tc>
-        <w:tc>
-          <w:tcPr>
-            <w:tcW w:type="dxa" w:w="1440"/>
-          </w:tcPr>
-          <w:p>
-            <w:r>
-              <w:t>0.701</w:t>
-            </w:r>
-          </w:p>
-        </w:tc>
-        <w:tc>
-          <w:tcPr>
-            <w:tcW w:type="dxa" w:w="1440"/>
-          </w:tcPr>
-          <w:p>
-            <w:r>
-              <w:t>6.984</w:t>
-            </w:r>
-          </w:p>
-        </w:tc>
-        <w:tc>
-          <w:tcPr>
-            <w:tcW w:type="dxa" w:w="1440"/>
-          </w:tcPr>
-          <w:p>
-            <w:r>
-              <w:t>0.1758</w:t>
-            </w:r>
-          </w:p>
-        </w:tc>
-        <w:tc>
-          <w:tcPr>
-            <w:tcW w:type="dxa" w:w="1440"/>
-          </w:tcPr>
-          <w:p>
-            <w:r/>
-          </w:p>
-        </w:tc>
-      </w:tr>
-      <w:tr>
-        <w:tc>
-          <w:tcPr>
-            <w:tcW w:type="dxa" w:w="1440"/>
-          </w:tcPr>
-          <w:p>
-            <w:r>
-              <w:t>race_mother_Srilankan Chetty</w:t>
-            </w:r>
-          </w:p>
-        </w:tc>
-        <w:tc>
-          <w:tcPr>
-            <w:tcW w:type="dxa" w:w="1440"/>
-          </w:tcPr>
-          <w:p>
-            <w:r>
-              <w:rPr>
-                <w:b/>
-                <w:color w:val="CC6600"/>
-              </w:rPr>
-              <w:t>1.196</w:t>
-            </w:r>
-          </w:p>
-        </w:tc>
-        <w:tc>
-          <w:tcPr>
-            <w:tcW w:type="dxa" w:w="1440"/>
-          </w:tcPr>
-          <w:p>
-            <w:r>
-              <w:t>0.130</w:t>
-            </w:r>
-          </w:p>
-        </w:tc>
-        <w:tc>
-          <w:tcPr>
-            <w:tcW w:type="dxa" w:w="1440"/>
-          </w:tcPr>
-          <w:p>
-            <w:r>
-              <w:t>11.003</w:t>
-            </w:r>
-          </w:p>
-        </w:tc>
-        <w:tc>
-          <w:tcPr>
-            <w:tcW w:type="dxa" w:w="1440"/>
-          </w:tcPr>
-          <w:p>
-            <w:r>
-              <w:t>0.8743</w:t>
-            </w:r>
-          </w:p>
-        </w:tc>
-        <w:tc>
-          <w:tcPr>
-            <w:tcW w:type="dxa" w:w="1440"/>
-          </w:tcPr>
-          <w:p>
-            <w:r/>
-          </w:p>
-        </w:tc>
-      </w:tr>
-      <w:tr>
-        <w:tc>
-          <w:tcPr>
-            <w:tcW w:type="dxa" w:w="1440"/>
-          </w:tcPr>
-          <w:p>
-            <w:r>
-              <w:t>race_mother_Srilankan Moor</w:t>
-            </w:r>
-          </w:p>
-        </w:tc>
-        <w:tc>
-          <w:tcPr>
-            <w:tcW w:type="dxa" w:w="1440"/>
-          </w:tcPr>
-          <w:p>
-            <w:r>
-              <w:rPr>
-                <w:b/>
-                <w:color w:val="CC6600"/>
-              </w:rPr>
-              <w:t>1.285</w:t>
-            </w:r>
-          </w:p>
-        </w:tc>
-        <w:tc>
-          <w:tcPr>
-            <w:tcW w:type="dxa" w:w="1440"/>
-          </w:tcPr>
-          <w:p>
-            <w:r>
-              <w:t>0.407</w:t>
-            </w:r>
-          </w:p>
-        </w:tc>
-        <w:tc>
-          <w:tcPr>
-            <w:tcW w:type="dxa" w:w="1440"/>
-          </w:tcPr>
-          <w:p>
-            <w:r>
-              <w:t>4.058</w:t>
-            </w:r>
-          </w:p>
-        </w:tc>
-        <w:tc>
-          <w:tcPr>
-            <w:tcW w:type="dxa" w:w="1440"/>
-          </w:tcPr>
-          <w:p>
-            <w:r>
-              <w:t>0.6688</w:t>
-            </w:r>
-          </w:p>
-        </w:tc>
-        <w:tc>
-          <w:tcPr>
-            <w:tcW w:type="dxa" w:w="1440"/>
-          </w:tcPr>
-          <w:p>
-            <w:r/>
-          </w:p>
-        </w:tc>
-      </w:tr>
-      <w:tr>
-        <w:tc>
-          <w:tcPr>
-            <w:tcW w:type="dxa" w:w="1440"/>
-          </w:tcPr>
-          <w:p>
-            <w:r>
-              <w:t>race_mother_Srilankan Tamil</w:t>
-            </w:r>
-          </w:p>
-        </w:tc>
-        <w:tc>
-          <w:tcPr>
-            <w:tcW w:type="dxa" w:w="1440"/>
-          </w:tcPr>
-          <w:p>
-            <w:r>
-              <w:rPr>
-                <w:b/>
-                <w:color w:val="CC6600"/>
-              </w:rPr>
-              <w:t>1.549</w:t>
-            </w:r>
-          </w:p>
-        </w:tc>
-        <w:tc>
-          <w:tcPr>
-            <w:tcW w:type="dxa" w:w="1440"/>
-          </w:tcPr>
-          <w:p>
-            <w:r>
-              <w:t>0.491</w:t>
-            </w:r>
-          </w:p>
-        </w:tc>
-        <w:tc>
-          <w:tcPr>
-            <w:tcW w:type="dxa" w:w="1440"/>
-          </w:tcPr>
-          <w:p>
-            <w:r>
-              <w:t>4.891</w:t>
-            </w:r>
-          </w:p>
-        </w:tc>
-        <w:tc>
-          <w:tcPr>
-            <w:tcW w:type="dxa" w:w="1440"/>
-          </w:tcPr>
-          <w:p>
-            <w:r>
-              <w:t>0.4557</w:t>
-            </w:r>
-          </w:p>
-        </w:tc>
-        <w:tc>
-          <w:tcPr>
-            <w:tcW w:type="dxa" w:w="1440"/>
-          </w:tcPr>
-          <w:p>
-            <w:r/>
-          </w:p>
-        </w:tc>
-      </w:tr>
-      <w:tr>
-        <w:tc>
-          <w:tcPr>
-            <w:tcW w:type="dxa" w:w="1440"/>
-          </w:tcPr>
-          <w:p>
-            <w:r>
-              <w:rPr>
-                <w:b/>
-              </w:rPr>
-              <w:t>child_sex_Male</w:t>
-            </w:r>
-          </w:p>
-        </w:tc>
-        <w:tc>
-          <w:tcPr>
-            <w:tcW w:type="dxa" w:w="1440"/>
-          </w:tcPr>
-          <w:p>
-            <w:r>
-              <w:rPr>
-                <w:b/>
-                <w:color w:val="CC6600"/>
-              </w:rPr>
-              <w:t>1.023</w:t>
-            </w:r>
-          </w:p>
-        </w:tc>
-        <w:tc>
-          <w:tcPr>
-            <w:tcW w:type="dxa" w:w="1440"/>
-          </w:tcPr>
-          <w:p>
-            <w:r>
-              <w:rPr>
-                <w:b/>
-              </w:rPr>
-              <w:t>1.008</w:t>
-            </w:r>
-          </w:p>
-        </w:tc>
-        <w:tc>
-          <w:tcPr>
-            <w:tcW w:type="dxa" w:w="1440"/>
-          </w:tcPr>
-          <w:p>
-            <w:r>
-              <w:rPr>
-                <w:b/>
-              </w:rPr>
-              <w:t>1.040</w:t>
-            </w:r>
-          </w:p>
-        </w:tc>
-        <w:tc>
-          <w:tcPr>
-            <w:tcW w:type="dxa" w:w="1440"/>
-          </w:tcPr>
-          <w:p>
-            <w:r>
-              <w:rPr>
-                <w:b/>
-              </w:rPr>
-              <w:t>0.0038</w:t>
-            </w:r>
-          </w:p>
-        </w:tc>
-        <w:tc>
-          <w:tcPr>
-            <w:tcW w:type="dxa" w:w="1440"/>
-          </w:tcPr>
-          <w:p>
-            <w:r>
-              <w:t>**</w:t>
-            </w:r>
-          </w:p>
-        </w:tc>
-      </w:tr>
-      <w:tr>
-        <w:tc>
-          <w:tcPr>
-            <w:tcW w:type="dxa" w:w="1440"/>
-          </w:tcPr>
-          <w:p>
-            <w:r>
-              <w:rPr>
-                <w:b/>
-              </w:rPr>
-              <w:t>Hospital or Not_Not In Hospital</w:t>
-            </w:r>
-          </w:p>
-        </w:tc>
-        <w:tc>
-          <w:tcPr>
-            <w:tcW w:type="dxa" w:w="1440"/>
-          </w:tcPr>
-          <w:p>
-            <w:r>
-              <w:rPr>
-                <w:b/>
-                <w:color w:val="0066CC"/>
-              </w:rPr>
-              <w:t>0.926</w:t>
-            </w:r>
-          </w:p>
-        </w:tc>
-        <w:tc>
-          <w:tcPr>
-            <w:tcW w:type="dxa" w:w="1440"/>
-          </w:tcPr>
-          <w:p>
-            <w:r>
-              <w:rPr>
-                <w:b/>
-              </w:rPr>
-              <w:t>0.864</w:t>
-            </w:r>
-          </w:p>
-        </w:tc>
-        <w:tc>
-          <w:tcPr>
-            <w:tcW w:type="dxa" w:w="1440"/>
-          </w:tcPr>
-          <w:p>
-            <w:r>
-              <w:rPr>
-                <w:b/>
-              </w:rPr>
-              <w:t>0.991</w:t>
-            </w:r>
-          </w:p>
-        </w:tc>
-        <w:tc>
-          <w:tcPr>
-            <w:tcW w:type="dxa" w:w="1440"/>
-          </w:tcPr>
-          <w:p>
-            <w:r>
-              <w:rPr>
-                <w:b/>
-              </w:rPr>
-              <w:t>0.0273</w:t>
-            </w:r>
-          </w:p>
-        </w:tc>
-        <w:tc>
-          <w:tcPr>
-            <w:tcW w:type="dxa" w:w="1440"/>
-          </w:tcPr>
-          <w:p>
-            <w:r>
-              <w:t>*</w:t>
-            </w:r>
-          </w:p>
-        </w:tc>
-      </w:tr>
-      <w:tr>
-        <w:tc>
-          <w:tcPr>
-            <w:tcW w:type="dxa" w:w="1440"/>
-          </w:tcPr>
-          <w:p>
-            <w:r>
-              <w:t>multiple_birth_Triplets</w:t>
-            </w:r>
-          </w:p>
-        </w:tc>
-        <w:tc>
-          <w:tcPr>
-            <w:tcW w:type="dxa" w:w="1440"/>
-          </w:tcPr>
-          <w:p>
-            <w:r>
-              <w:rPr>
-                <w:b/>
-                <w:color w:val="0066CC"/>
-              </w:rPr>
-              <w:t>0.864</w:t>
-            </w:r>
-          </w:p>
-        </w:tc>
-        <w:tc>
-          <w:tcPr>
-            <w:tcW w:type="dxa" w:w="1440"/>
-          </w:tcPr>
-          <w:p>
-            <w:r>
-              <w:t>0.431</w:t>
-            </w:r>
-          </w:p>
-        </w:tc>
-        <w:tc>
-          <w:tcPr>
-            <w:tcW w:type="dxa" w:w="1440"/>
-          </w:tcPr>
-          <w:p>
-            <w:r>
-              <w:t>1.732</w:t>
-            </w:r>
-          </w:p>
-        </w:tc>
-        <w:tc>
-          <w:tcPr>
-            <w:tcW w:type="dxa" w:w="1440"/>
-          </w:tcPr>
-          <w:p>
-            <w:r>
-              <w:t>0.6803</w:t>
-            </w:r>
-          </w:p>
-        </w:tc>
-        <w:tc>
-          <w:tcPr>
-            <w:tcW w:type="dxa" w:w="1440"/>
-          </w:tcPr>
-          <w:p>
-            <w:r/>
-          </w:p>
-        </w:tc>
-      </w:tr>
-      <w:tr>
-        <w:tc>
-          <w:tcPr>
-            <w:tcW w:type="dxa" w:w="1440"/>
-          </w:tcPr>
-          <w:p>
-            <w:r>
-              <w:rPr>
-                <w:b/>
-              </w:rPr>
-              <w:t>Birth_Weight(grams)</w:t>
-            </w:r>
-          </w:p>
-        </w:tc>
-        <w:tc>
-          <w:tcPr>
-            <w:tcW w:type="dxa" w:w="1440"/>
-          </w:tcPr>
-          <w:p>
-            <w:r>
-              <w:t>1.000</w:t>
-            </w:r>
-          </w:p>
-        </w:tc>
-        <w:tc>
-          <w:tcPr>
-            <w:tcW w:type="dxa" w:w="1440"/>
-          </w:tcPr>
-          <w:p>
-            <w:r>
-              <w:rPr>
-                <w:b/>
-              </w:rPr>
-              <w:t>1.000</w:t>
-            </w:r>
-          </w:p>
-        </w:tc>
-        <w:tc>
-          <w:tcPr>
-            <w:tcW w:type="dxa" w:w="1440"/>
-          </w:tcPr>
-          <w:p>
-            <w:r>
-              <w:rPr>
-                <w:b/>
-              </w:rPr>
-              <w:t>1.000</w:t>
-            </w:r>
-          </w:p>
-        </w:tc>
-        <w:tc>
-          <w:tcPr>
-            <w:tcW w:type="dxa" w:w="1440"/>
-          </w:tcPr>
-          <w:p>
-            <w:r>
-              <w:rPr>
-                <w:b/>
-              </w:rPr>
-              <w:t>0.0000</w:t>
-            </w:r>
-          </w:p>
-        </w:tc>
-        <w:tc>
-          <w:tcPr>
-            <w:tcW w:type="dxa" w:w="1440"/>
-          </w:tcPr>
-          <w:p>
-            <w:r>
-              <w:t>***</w:t>
-            </w:r>
-          </w:p>
-        </w:tc>
-      </w:tr>
-    </w:tbl>
-    <w:p>
-      <w:r>
-        <w:rPr>
-          <w:sz w:val="18"/>
-        </w:rPr>
-        <w:t xml:space="preserve">Significance codes: </w:t>
-      </w:r>
-      <w:r>
-        <w:rPr>
-          <w:sz w:val="18"/>
-        </w:rPr>
-        <w:t xml:space="preserve">*** p&lt;0.001, </w:t>
-      </w:r>
-      <w:r>
-        <w:rPr>
-          <w:sz w:val="18"/>
-        </w:rPr>
-        <w:t xml:space="preserve">** p&lt;0.01, </w:t>
-      </w:r>
-      <w:r>
-        <w:rPr>
-          <w:sz w:val="18"/>
-        </w:rPr>
-        <w:t>* p&lt;0.05</w:t>
-      </w:r>
-    </w:p>
-    <w:p>
-      <w:pPr>
-        <w:pStyle w:val="Heading2"/>
-      </w:pPr>
-      <w:r>
-        <w:t>Summary of Odds Ratios Analysis</w:t>
-      </w:r>
-    </w:p>
-    <w:tbl>
-      <w:tblPr>
-        <w:tblStyle w:val="LightShading"/>
-        <w:tblW w:type="auto" w:w="0"/>
-        <w:tblLayout w:type="fixed"/>
-        <w:tblLook w:firstColumn="1" w:firstRow="1" w:lastColumn="0" w:lastRow="0" w:noHBand="0" w:noVBand="1" w:val="04A0"/>
-      </w:tblPr>
-      <w:tblGrid>
-        <w:gridCol w:w="4320"/>
-        <w:gridCol w:w="3600"/>
-      </w:tblGrid>
-      <w:tr>
-        <w:tc>
-          <w:tcPr>
-            <w:tcW w:type="dxa" w:w="4320"/>
-          </w:tcPr>
-          <w:p>
-            <w:r>
-              <w:rPr>
-                <w:b/>
-              </w:rPr>
-              <w:t>Metric</w:t>
-            </w:r>
-          </w:p>
-        </w:tc>
-        <w:tc>
-          <w:tcPr>
-            <w:tcW w:type="dxa" w:w="4320"/>
-          </w:tcPr>
-          <w:p>
-            <w:r>
-              <w:rPr>
-                <w:b/>
-              </w:rPr>
-              <w:t>Count</w:t>
-            </w:r>
-          </w:p>
-        </w:tc>
-      </w:tr>
-      <w:tr>
-        <w:tc>
-          <w:tcPr>
-            <w:tcW w:type="dxa" w:w="4320"/>
-          </w:tcPr>
-          <w:p>
-            <w:r>
-              <w:t>Total Predictors Analyzed</w:t>
-            </w:r>
-          </w:p>
-        </w:tc>
-        <w:tc>
-          <w:tcPr>
-            <w:tcW w:type="dxa" w:w="4320"/>
-          </w:tcPr>
-          <w:p>
-            <w:r>
-              <w:t>20</w:t>
-            </w:r>
-          </w:p>
-        </w:tc>
-      </w:tr>
-      <w:tr>
-        <w:tc>
-          <w:tcPr>
-            <w:tcW w:type="dxa" w:w="4320"/>
-          </w:tcPr>
-          <w:p>
-            <w:r>
-              <w:t>Significant Predictors (p &lt; 0.05)</w:t>
-            </w:r>
-          </w:p>
-        </w:tc>
-        <w:tc>
-          <w:tcPr>
-            <w:tcW w:type="dxa" w:w="4320"/>
-          </w:tcPr>
-          <w:p>
-            <w:r>
-              <w:t>9</w:t>
-            </w:r>
-          </w:p>
-        </w:tc>
-      </w:tr>
-      <w:tr>
-        <w:tc>
-          <w:tcPr>
-            <w:tcW w:type="dxa" w:w="4320"/>
-          </w:tcPr>
-          <w:p>
-            <w:r>
-              <w:t>Positive Associations (OR &gt; 1)</w:t>
-            </w:r>
-          </w:p>
-        </w:tc>
-        <w:tc>
-          <w:tcPr>
-            <w:tcW w:type="dxa" w:w="4320"/>
-          </w:tcPr>
-          <w:p>
-            <w:r>
-              <w:t>13 (higher odds of first-born)</w:t>
-            </w:r>
-          </w:p>
-        </w:tc>
-      </w:tr>
-      <w:tr>
-        <w:tc>
-          <w:tcPr>
-            <w:tcW w:type="dxa" w:w="4320"/>
-          </w:tcPr>
-          <w:p>
-            <w:r>
-              <w:t>Negative Associations (OR &lt; 1)</w:t>
-            </w:r>
-          </w:p>
-        </w:tc>
-        <w:tc>
-          <w:tcPr>
-            <w:tcW w:type="dxa" w:w="4320"/>
-          </w:tcPr>
-          <w:p>
-            <w:r>
-              <w:t>6 (lower odds of first-born)</w:t>
-            </w:r>
-          </w:p>
-        </w:tc>
-      </w:tr>
-      <w:tr>
-        <w:tc>
-          <w:tcPr>
-            <w:tcW w:type="dxa" w:w="4320"/>
-          </w:tcPr>
-          <w:p>
-            <w:r>
-              <w:t>Neutral Associations (OR = 1)</w:t>
-            </w:r>
-          </w:p>
-        </w:tc>
-        <w:tc>
-          <w:tcPr>
-            <w:tcW w:type="dxa" w:w="4320"/>
-          </w:tcPr>
-          <w:p>
-            <w:r>
-              <w:t>1</w:t>
-            </w:r>
-          </w:p>
-        </w:tc>
-      </w:tr>
-    </w:tbl>
-    <w:p>
-      <w:pPr>
-        <w:pStyle w:val="Heading2"/>
-      </w:pPr>
-      <w:r>
-        <w:t>Top 5 Positive Associations (Higher Odds of First-born)</w:t>
-      </w:r>
-    </w:p>
-    <w:tbl>
-      <w:tblPr>
-        <w:tblStyle w:val="LightShading"/>
-        <w:tblW w:type="auto" w:w="0"/>
-        <w:tblLook w:firstColumn="1" w:firstRow="1" w:lastColumn="0" w:lastRow="0" w:noHBand="0" w:noVBand="1" w:val="04A0"/>
-      </w:tblPr>
-      <w:tblGrid>
-        <w:gridCol w:w="2160"/>
-        <w:gridCol w:w="2160"/>
-        <w:gridCol w:w="2160"/>
-        <w:gridCol w:w="2160"/>
-      </w:tblGrid>
-      <w:tr>
-        <w:tc>
-          <w:tcPr>
             <w:tcW w:type="dxa" w:w="2160"/>
           </w:tcPr>
           <w:p>
             <w:r>
-              <w:rPr>
-                <w:b/>
-              </w:rPr>
-              <w:t>Predictor</w:t>
-            </w:r>
-          </w:p>
-        </w:tc>
-        <w:tc>
-          <w:tcPr>
-            <w:tcW w:type="dxa" w:w="2160"/>
-          </w:tcPr>
-          <w:p>
-            <w:r>
-              <w:rPr>
-                <w:b/>
-              </w:rPr>
-              <w:t>Odds Ratio</w:t>
-            </w:r>
-          </w:p>
-        </w:tc>
-        <w:tc>
-          <w:tcPr>
-            <w:tcW w:type="dxa" w:w="2160"/>
-          </w:tcPr>
-          <w:p>
-            <w:r>
-              <w:rPr>
-                <w:b/>
-              </w:rPr>
-              <w:t>95% CI</w:t>
-            </w:r>
-          </w:p>
-        </w:tc>
-        <w:tc>
-          <w:tcPr>
-            <w:tcW w:type="dxa" w:w="2160"/>
-          </w:tcPr>
-          <w:p>
-            <w:r>
-              <w:rPr>
-                <w:b/>
-              </w:rPr>
-              <w:t>Effect</w:t>
-            </w:r>
-          </w:p>
-        </w:tc>
-      </w:tr>
-      <w:tr>
-        <w:tc>
-          <w:tcPr>
-            <w:tcW w:type="dxa" w:w="2160"/>
-          </w:tcPr>
-          <w:p>
-            <w:r>
-              <w:t>race_mother_Other Foreigners</w:t>
-            </w:r>
-          </w:p>
-        </w:tc>
-        <w:tc>
-          <w:tcPr>
-            <w:tcW w:type="dxa" w:w="2160"/>
-          </w:tcPr>
-          <w:p>
-            <w:r>
-              <w:rPr>
-                <w:b/>
-                <w:color w:val="CC6600"/>
-              </w:rPr>
-              <w:t>3.615</w:t>
-            </w:r>
-          </w:p>
-        </w:tc>
-        <w:tc>
-          <w:tcPr>
-            <w:tcW w:type="dxa" w:w="2160"/>
-          </w:tcPr>
-          <w:p>
-            <w:r>
-              <w:t>(1.075-12.153)</w:t>
-            </w:r>
-          </w:p>
-        </w:tc>
-        <w:tc>
-          <w:tcPr>
-            <w:tcW w:type="dxa" w:w="2160"/>
-          </w:tcPr>
-          <w:p>
-            <w:r>
-              <w:t>261.5% increase</w:t>
-            </w:r>
-          </w:p>
-        </w:tc>
-      </w:tr>
-      <w:tr>
-        <w:tc>
-          <w:tcPr>
-            <w:tcW w:type="dxa" w:w="2160"/>
-          </w:tcPr>
-          <w:p>
-            <w:r>
-              <w:t>race_mother_Pakistan Moor</w:t>
-            </w:r>
-          </w:p>
-        </w:tc>
-        <w:tc>
-          <w:tcPr>
-            <w:tcW w:type="dxa" w:w="2160"/>
-          </w:tcPr>
-          <w:p>
-            <w:r>
-              <w:rPr>
-                <w:b/>
-                <w:color w:val="CC6600"/>
-              </w:rPr>
-              <w:t>2.270</w:t>
-            </w:r>
-          </w:p>
-        </w:tc>
-        <w:tc>
-          <w:tcPr>
-            <w:tcW w:type="dxa" w:w="2160"/>
-          </w:tcPr>
-          <w:p>
-            <w:r>
-              <w:t>(0.666-7.744)</w:t>
+              <w:t>(0.666-7.743)</w:t>
             </w:r>
           </w:p>
         </w:tc>
@@ -8383,367 +6428,6 @@
           </w:p>
         </w:tc>
       </w:tr>
-    </w:tbl>
-    <w:p>
-      <w:pPr>
-        <w:pStyle w:val="Heading1"/>
-      </w:pPr>
-      <w:r>
-        <w:t>7.4 ROC Curve &amp; Model Discriminative Ability</w:t>
-      </w:r>
-    </w:p>
-    <w:p>
-      <w:r>
-        <w:t>The Receiver Operating Characteristic (ROC) curve evaluates the discriminative ability of the binary logistic regression model. It plots the True Positive Rate (Sensitivity) against the False Positive Rate (1 - Specificity) at various threshold settings.</w:t>
-      </w:r>
-    </w:p>
-    <w:p>
-      <w:pPr>
-        <w:pStyle w:val="IntenseQuote"/>
-      </w:pPr>
-      <w:r>
-        <w:t>AUC (Area Under the Curve) Interpretation:</w:t>
-        <w:br/>
-        <w:t>• AUC = 0.50: No discriminative ability (random guessing)</w:t>
-        <w:br/>
-        <w:t>• 0.70 ≤ AUC &lt; 0.80: Acceptable discrimination</w:t>
-        <w:br/>
-        <w:t>• 0.80 ≤ AUC &lt; 0.90: Good discrimination</w:t>
-        <w:br/>
-        <w:t>• AUC ≥ 0.90: Excellent discrimination</w:t>
-      </w:r>
-    </w:p>
-    <w:p>
-      <w:pPr>
-        <w:pStyle w:val="Heading2"/>
-      </w:pPr>
-      <w:r>
-        <w:t>ROC Curve</w:t>
-      </w:r>
-    </w:p>
-    <w:p>
-      <w:pPr>
-        <w:jc w:val="center"/>
-      </w:pPr>
-      <w:r>
-        <w:drawing>
-          <wp:inline xmlns:a="http://schemas.openxmlformats.org/drawingml/2006/main" xmlns:pic="http://schemas.openxmlformats.org/drawingml/2006/picture">
-            <wp:extent cx="5029200" cy="4191000"/>
-            <wp:docPr id="3" name="Picture 3"/>
-            <wp:cNvGraphicFramePr>
-              <a:graphicFrameLocks noChangeAspect="1"/>
-            </wp:cNvGraphicFramePr>
-            <a:graphic>
-              <a:graphicData uri="http://schemas.openxmlformats.org/drawingml/2006/picture">
-                <pic:pic>
-                  <pic:nvPicPr>
-                    <pic:cNvPr id="0" name="fig8_roc_curve_hd.png"/>
-                    <pic:cNvPicPr/>
-                  </pic:nvPicPr>
-                  <pic:blipFill>
-                    <a:blip r:embed="rId10"/>
-                    <a:stretch>
-                      <a:fillRect/>
-                    </a:stretch>
-                  </pic:blipFill>
-                  <pic:spPr>
-                    <a:xfrm>
-                      <a:off x="0" y="0"/>
-                      <a:ext cx="5029200" cy="4191000"/>
-                    </a:xfrm>
-                    <a:prstGeom prst="rect"/>
-                  </pic:spPr>
-                </pic:pic>
-              </a:graphicData>
-            </a:graphic>
-          </wp:inline>
-        </w:drawing>
-      </w:r>
-    </w:p>
-    <w:p>
-      <w:pPr>
-        <w:jc w:val="center"/>
-      </w:pPr>
-      <w:r>
-        <w:rPr>
-          <w:i/>
-          <w:sz w:val="18"/>
-        </w:rPr>
-        <w:t>Figure 7.2: ROC Curve for Binary Logistic Regression Model</w:t>
-      </w:r>
-    </w:p>
-    <w:p>
-      <w:pPr>
-        <w:pStyle w:val="Heading2"/>
-      </w:pPr>
-      <w:r>
-        <w:t>Area Under the Curve (AUC) Results</w:t>
-      </w:r>
-    </w:p>
-    <w:tbl>
-      <w:tblPr>
-        <w:tblStyle w:val="LightGrid-Accent1"/>
-        <w:tblW w:type="auto" w:w="0"/>
-        <w:tblLayout w:type="fixed"/>
-        <w:tblLook w:firstColumn="1" w:firstRow="1" w:lastColumn="0" w:lastRow="0" w:noHBand="0" w:noVBand="1" w:val="04A0"/>
-      </w:tblPr>
-      <w:tblGrid>
-        <w:gridCol w:w="3600"/>
-        <w:gridCol w:w="4320"/>
-      </w:tblGrid>
-      <w:tr>
-        <w:tc>
-          <w:tcPr>
-            <w:tcW w:type="dxa" w:w="4320"/>
-          </w:tcPr>
-          <w:p>
-            <w:r>
-              <w:rPr>
-                <w:b/>
-              </w:rPr>
-              <w:t>Metric</w:t>
-            </w:r>
-          </w:p>
-        </w:tc>
-        <w:tc>
-          <w:tcPr>
-            <w:tcW w:type="dxa" w:w="4320"/>
-          </w:tcPr>
-          <w:p>
-            <w:r>
-              <w:rPr>
-                <w:b/>
-              </w:rPr>
-              <w:t>Value</w:t>
-            </w:r>
-          </w:p>
-        </w:tc>
-      </w:tr>
-      <w:tr>
-        <w:tc>
-          <w:tcPr>
-            <w:tcW w:type="dxa" w:w="4320"/>
-          </w:tcPr>
-          <w:p>
-            <w:r>
-              <w:t>AUC Score</w:t>
-            </w:r>
-          </w:p>
-        </w:tc>
-        <w:tc>
-          <w:tcPr>
-            <w:tcW w:type="dxa" w:w="4320"/>
-          </w:tcPr>
-          <w:p>
-            <w:r>
-              <w:rPr>
-                <w:b/>
-                <w:color w:val="FF8C00"/>
-              </w:rPr>
-              <w:t>0.7552</w:t>
-            </w:r>
-          </w:p>
-        </w:tc>
-      </w:tr>
-      <w:tr>
-        <w:tc>
-          <w:tcPr>
-            <w:tcW w:type="dxa" w:w="4320"/>
-          </w:tcPr>
-          <w:p>
-            <w:r>
-              <w:t>Discriminative Ability</w:t>
-            </w:r>
-          </w:p>
-        </w:tc>
-        <w:tc>
-          <w:tcPr>
-            <w:tcW w:type="dxa" w:w="4320"/>
-          </w:tcPr>
-          <w:p>
-            <w:r>
-              <w:t>Acceptable</w:t>
-            </w:r>
-          </w:p>
-        </w:tc>
-      </w:tr>
-    </w:tbl>
-    <w:p>
-      <w:r>
-        <w:rPr>
-          <w:b/>
-          <w:color w:val="008000"/>
-        </w:rPr>
-        <w:t>✓ The model shows acceptable discriminative ability (AUC = 0.755)</w:t>
-      </w:r>
-    </w:p>
-    <w:p>
-      <w:r>
-        <w:t>The model can effectively distinguish between first-born and later-born cases with 75.5% accuracy (where 50% is random guessing).</w:t>
-      </w:r>
-    </w:p>
-    <w:p>
-      <w:pPr>
-        <w:pStyle w:val="Heading2"/>
-      </w:pPr>
-      <w:r>
-        <w:t>Optimal Cutoff Analysis (Youden's J Statistic)</w:t>
-      </w:r>
-    </w:p>
-    <w:p>
-      <w:r>
-        <w:t>The optimal probability cutoff maximizes sensitivity and specificity simultaneously using Youden's J statistic (J = Sensitivity + Specificity - 1).</w:t>
-      </w:r>
-    </w:p>
-    <w:tbl>
-      <w:tblPr>
-        <w:tblStyle w:val="LightShading"/>
-        <w:tblW w:type="auto" w:w="0"/>
-        <w:tblLayout w:type="fixed"/>
-        <w:tblLook w:firstColumn="1" w:firstRow="1" w:lastColumn="0" w:lastRow="0" w:noHBand="0" w:noVBand="1" w:val="04A0"/>
-      </w:tblPr>
-      <w:tblGrid>
-        <w:gridCol w:w="3600"/>
-        <w:gridCol w:w="4320"/>
-      </w:tblGrid>
-      <w:tr>
-        <w:tc>
-          <w:tcPr>
-            <w:tcW w:type="dxa" w:w="4320"/>
-          </w:tcPr>
-          <w:p>
-            <w:r>
-              <w:rPr>
-                <w:b/>
-              </w:rPr>
-              <w:t>Metric</w:t>
-            </w:r>
-          </w:p>
-        </w:tc>
-        <w:tc>
-          <w:tcPr>
-            <w:tcW w:type="dxa" w:w="4320"/>
-          </w:tcPr>
-          <w:p>
-            <w:r>
-              <w:rPr>
-                <w:b/>
-              </w:rPr>
-              <w:t>Value at Optimal Cutoff</w:t>
-            </w:r>
-          </w:p>
-        </w:tc>
-      </w:tr>
-      <w:tr>
-        <w:tc>
-          <w:tcPr>
-            <w:tcW w:type="dxa" w:w="4320"/>
-          </w:tcPr>
-          <w:p>
-            <w:r>
-              <w:t>Optimal Probability Cutoff</w:t>
-            </w:r>
-          </w:p>
-        </w:tc>
-        <w:tc>
-          <w:tcPr>
-            <w:tcW w:type="dxa" w:w="4320"/>
-          </w:tcPr>
-          <w:p>
-            <w:r>
-              <w:t>0.4312</w:t>
-            </w:r>
-          </w:p>
-        </w:tc>
-      </w:tr>
-      <w:tr>
-        <w:tc>
-          <w:tcPr>
-            <w:tcW w:type="dxa" w:w="4320"/>
-          </w:tcPr>
-          <w:p>
-            <w:r>
-              <w:t>Sensitivity at Cutoff</w:t>
-            </w:r>
-          </w:p>
-        </w:tc>
-        <w:tc>
-          <w:tcPr>
-            <w:tcW w:type="dxa" w:w="4320"/>
-          </w:tcPr>
-          <w:p>
-            <w:r>
-              <w:t>0.7081</w:t>
-            </w:r>
-          </w:p>
-        </w:tc>
-      </w:tr>
-      <w:tr>
-        <w:tc>
-          <w:tcPr>
-            <w:tcW w:type="dxa" w:w="4320"/>
-          </w:tcPr>
-          <w:p>
-            <w:r>
-              <w:t>Specificity at Cutoff</w:t>
-            </w:r>
-          </w:p>
-        </w:tc>
-        <w:tc>
-          <w:tcPr>
-            <w:tcW w:type="dxa" w:w="4320"/>
-          </w:tcPr>
-          <w:p>
-            <w:r>
-              <w:t>0.6731</w:t>
-            </w:r>
-          </w:p>
-        </w:tc>
-      </w:tr>
-      <w:tr>
-        <w:tc>
-          <w:tcPr>
-            <w:tcW w:type="dxa" w:w="4320"/>
-          </w:tcPr>
-          <w:p>
-            <w:r>
-              <w:t>Accuracy at Cutoff</w:t>
-            </w:r>
-          </w:p>
-        </w:tc>
-        <w:tc>
-          <w:tcPr>
-            <w:tcW w:type="dxa" w:w="4320"/>
-          </w:tcPr>
-          <w:p>
-            <w:r>
-              <w:t>0.6887</w:t>
-            </w:r>
-          </w:p>
-        </w:tc>
-      </w:tr>
-      <w:tr>
-        <w:tc>
-          <w:tcPr>
-            <w:tcW w:type="dxa" w:w="4320"/>
-          </w:tcPr>
-          <w:p>
-            <w:r>
-              <w:t>Precision at Cutoff</w:t>
-            </w:r>
-          </w:p>
-        </w:tc>
-        <w:tc>
-          <w:tcPr>
-            <w:tcW w:type="dxa" w:w="4320"/>
-          </w:tcPr>
-          <w:p>
-            <w:r>
-              <w:t>0.6339</w:t>
-            </w:r>
-          </w:p>
-        </w:tc>
-      </w:tr>
       <w:tr>
         <w:tc>
           <w:tcPr>
@@ -9116,7 +6800,7 @@
         <w:drawing>
           <wp:inline xmlns:a="http://schemas.openxmlformats.org/drawingml/2006/main" xmlns:pic="http://schemas.openxmlformats.org/drawingml/2006/picture">
             <wp:extent cx="5029200" cy="4023360"/>
-            <wp:docPr id="4" name="Picture 4"/>
+            <wp:docPr id="3" name="Picture 3"/>
             <wp:cNvGraphicFramePr>
               <a:graphicFrameLocks noChangeAspect="1"/>
             </wp:cNvGraphicFramePr>
@@ -9301,7 +6985,7 @@
           </w:tcPr>
           <w:p>
             <w:r>
-              <w:t>62927</w:t>
+              <w:t>62926</w:t>
             </w:r>
           </w:p>
         </w:tc>
@@ -9333,7 +7017,7 @@
           </w:tcPr>
           <w:p>
             <w:r>
-              <w:t>78456</w:t>
+              <w:t>78455</w:t>
             </w:r>
           </w:p>
         </w:tc>
@@ -9988,7 +7672,7 @@
           </w:tcPr>
           <w:p>
             <w:r>
-              <w:t>141383</w:t>
+              <w:t>141381</w:t>
             </w:r>
           </w:p>
         </w:tc>
@@ -10036,7 +7720,7 @@
           </w:tcPr>
           <w:p>
             <w:r>
-              <w:t>318290</w:t>
+              <w:t>318288</w:t>
             </w:r>
           </w:p>
         </w:tc>
@@ -10168,7 +7852,7 @@
         <w:t xml:space="preserve">Type II Errors (False Negatives): </w:t>
       </w:r>
       <w:r>
-        <w:t>62927 cases were incorrectly classified as later-born when they were actually first-born.</w:t>
+        <w:t>62926 cases were incorrectly classified as later-born when they were actually first-born.</w:t>
         <w:br/>
         <w:br/>
       </w:r>

</xml_diff>